<commit_message>
check in code before swith to temp table
</commit_message>
<xml_diff>
--- a/src/SchedulePCMcp/templates/Schedule_PC_Position_Evaluation_Template_Updated.docx
+++ b/src/SchedulePCMcp/templates/Schedule_PC_Position_Evaluation_Template_Updated.docx
@@ -16,7 +16,7 @@
           <w:sz w:val="32"/>
           <w:szCs w:val="32"/>
         </w:rPr>
-        <w:t xml:space="preserve">Schedule Policy/Career Position Evaluation Form</w:t>
+        <w:t>Schedule Policy/Career Position Evaluation Form</w:t>
       </w:r>
     </w:p>
     <w:p>
@@ -250,7 +250,7 @@
               <w:rPr>
                 <w:b/>
               </w:rPr>
-              <w:t>Agency/Subcomponent</w:t>
+              <w:t>Org Code</w:t>
             </w:r>
           </w:p>
         </w:tc>
@@ -953,7 +953,7 @@
                 <w:sz w:val="20"/>
                 <w:szCs w:val="20"/>
               </w:rPr>
-              <w:t xml:space="preserve">– Representing, promoting, or defending the agency’s or Administration’s policy positions before internal or external stakeholders.</w:t>
+              <w:t>– Representing, promoting, or defending the agency’s or Administration’s policy positions before internal or external stakeholders.</w:t>
             </w:r>
           </w:p>
         </w:tc>
@@ -1862,7 +1862,6 @@
                 <w:b/>
                 <w:bCs/>
               </w:rPr>
-              <w:lastRenderedPageBreak/>
               <w:t>Agency Head Approving Official</w:t>
             </w:r>
           </w:p>

</xml_diff>